<commit_message>
Restore Liu et al. (2020) SPIRIT-AI/CONSORT-AI reference orphaned by V25 trim
Section 8.8 cites the reporting-guideline extensions for the proposed
randomised study; the reference was removed with the broader-AI batch.
Restored alphabetically (Lewin < Liu < Locke). Corrected orphan check
(References heading located by style, not ToC line) shows no other
orphans.

Co-Authored-By: Claude Fable 5 <noreply@anthropic.com>
Claude-Session: https://claude.ai/code/session_01KoT3i8geZspYBMMKVYJUTG
</commit_message>
<xml_diff>
--- a/docs/thesis/Full_version_V26_EngD_Thesis_Submission_Draft.docx
+++ b/docs/thesis/Full_version_V26_EngD_Thesis_Submission_Draft.docx
@@ -25525,6 +25525,12 @@
           <w:sz w:val="24"/>
         </w:rPr>
         <w:t>Lewin, K. (1946). Action research and minority problems. Journal of Social Issues, 2(4), 34–46.</w:t>
+      </w:r>
+    </w:p>
+    <w:p>
+      <w:pPr/>
+      <w:r>
+        <w:t>Liu, X., Cruz Rivera, S., Moher, D., Calvert, M. J., Denniston, A. K., &amp; SPIRIT-AI and CONSORT-AI Working Group. (2020). Reporting guidelines for clinical trials evaluating artificial intelligence interventions: The SPIRIT-AI and CONSORT-AI extensions. Nature Medicine, 26(9), 1364-1374.</w:t>
       </w:r>
     </w:p>
     <w:p>

</xml_diff>